<commit_message>
Lifecycle confirmations: SMS, deliverability setup, 99%+ deliverability added to profile; Artifact Uprising rescored 66, PCH rescored 53, both resumes rebuilt
Co-Authored-By: Claude Opus 5.5 <noreply@anthropic.com>
Claude-Session: https://claude.ai/code/session_01FBRQCEuHNbZjQ9zAhKMdjS
</commit_message>
<xml_diff>
--- a/applications/arb-pch-lifecycle-retention-marketing-manager/PCH-LifecycleRetentionManager-Resume.docx
+++ b/applications/arb-pch-lifecycle-retention-marketing-manager/PCH-LifecycleRetentionManager-Resume.docx
@@ -177,7 +177,31 @@
           <w:i w:val="0"/>
           <w:color w:val="1A1A1A"/>
         </w:rPr>
-        <w:t>Architected a 20+ workflow lifecycle system: capture and welcome, qualification, booking confirmations and reminders, no-show recovery, post-sale onboarding nurture, long-term nurture and reactivation, and review generation.</w:t>
+        <w:t>Architected a 20+ workflow email and SMS lifecycle system: welcome, qualification, booking confirmations and reminders, no-show recovery, post-sale onboarding, nurture and reactivation, and review generation.</w:t>
+      </w:r>
+    </w:p>
+    <w:p>
+      <w:pPr>
+        <w:spacing w:after="30"/>
+        <w:ind w:left="259" w:hanging="259"/>
+      </w:pPr>
+      <w:r>
+        <w:rPr>
+          <w:rFonts w:ascii="Calibri" w:hAnsi="Calibri"/>
+          <w:b w:val="0"/>
+          <w:i w:val="0"/>
+          <w:color w:val="163A5F"/>
+        </w:rPr>
+        <w:t xml:space="preserve">•  </w:t>
+      </w:r>
+      <w:r>
+        <w:rPr>
+          <w:rFonts w:ascii="Calibri" w:hAnsi="Calibri"/>
+          <w:b w:val="0"/>
+          <w:i w:val="0"/>
+          <w:color w:val="1A1A1A"/>
+        </w:rPr>
+        <w:t>Set up sending domains, SPF/DKIM/DMARC authentication, and warm-up myself, holding email deliverability above 99%.</w:t>
       </w:r>
     </w:p>
     <w:p>
@@ -250,30 +274,6 @@
           <w:color w:val="1A1A1A"/>
         </w:rPr>
         <w:t>Build custom GA4 conversion events, triggers, and variables in Google Tag Manager, validated in Preview mode and browser developer tools.</w:t>
-      </w:r>
-    </w:p>
-    <w:p>
-      <w:pPr>
-        <w:spacing w:after="30"/>
-        <w:ind w:left="259" w:hanging="259"/>
-      </w:pPr>
-      <w:r>
-        <w:rPr>
-          <w:rFonts w:ascii="Calibri" w:hAnsi="Calibri"/>
-          <w:b w:val="0"/>
-          <w:i w:val="0"/>
-          <w:color w:val="163A5F"/>
-        </w:rPr>
-        <w:t xml:space="preserve">•  </w:t>
-      </w:r>
-      <w:r>
-        <w:rPr>
-          <w:rFonts w:ascii="Calibri" w:hAnsi="Calibri"/>
-          <w:b w:val="0"/>
-          <w:i w:val="0"/>
-          <w:color w:val="1A1A1A"/>
-        </w:rPr>
-        <w:t>Write the email copy and sequences myself and build dashboards tying funnel progression to campaign ROI.</w:t>
       </w:r>
     </w:p>
     <w:p>
@@ -699,7 +699,7 @@
           <w:i w:val="0"/>
           <w:color w:val="1A1A1A"/>
         </w:rPr>
-        <w:t>Behavior-Based Segmentation, Welcome, Post-Purchase &amp; Win-Back Flows, A/B Testing, Automation QA</w:t>
+        <w:t>Email &amp; SMS Segmentation, Welcome, Post-Purchase &amp; Win-Back Flows, A/B Testing &amp; Automation QA, Deliverability (99%+)</w:t>
       </w:r>
     </w:p>
     <w:p>

</xml_diff>